<commit_message>
The Configurations for Ablation Study
</commit_message>
<xml_diff>
--- a/docs/Configurations.docx
+++ b/docs/Configurations.docx
@@ -3,14 +3,58 @@
 <w:document xmlns:wpc="http://schemas.microsoft.com/office/word/2010/wordprocessingCanvas" xmlns:cx="http://schemas.microsoft.com/office/drawing/2014/chartex" xmlns:cx1="http://schemas.microsoft.com/office/drawing/2015/9/8/chartex" xmlns:cx2="http://schemas.microsoft.com/office/drawing/2015/10/21/chartex" xmlns:cx3="http://schemas.microsoft.com/office/drawing/2016/5/9/chartex" xmlns:cx4="http://schemas.microsoft.com/office/drawing/2016/5/10/chartex" xmlns:cx5="http://schemas.microsoft.com/office/drawing/2016/5/11/chartex" xmlns:cx6="http://schemas.microsoft.com/office/drawing/2016/5/12/chartex" xmlns:cx7="http://schemas.microsoft.com/office/drawing/2016/5/13/chartex" xmlns:cx8="http://schemas.microsoft.com/office/drawing/2016/5/14/chartex" xmlns:mc="http://schemas.openxmlformats.org/markup-compatibility/2006" xmlns:aink="http://schemas.microsoft.com/office/drawing/2016/ink" xmlns:am3d="http://schemas.microsoft.com/office/drawing/2017/model3d" xmlns:o="urn:schemas-microsoft-com:office:office" xmlns:oel="http://schemas.microsoft.com/office/2019/extlst" xmlns:r="http://schemas.openxmlformats.org/officeDocument/2006/relationships" xmlns:m="http://schemas.openxmlformats.org/officeDocument/2006/math" xmlns:v="urn:schemas-microsoft-com:vml" xmlns:wp14="http://schemas.microsoft.com/office/word/2010/wordprocessingDrawing" xmlns:wp="http://schemas.openxmlformats.org/drawingml/2006/wordprocessingDrawing" xmlns:w10="urn:schemas-microsoft-com:office:word" xmlns:w="http://schemas.openxmlformats.org/wordprocessingml/2006/main" xmlns:w14="http://schemas.microsoft.com/office/word/2010/wordml" xmlns:w15="http://schemas.microsoft.com/office/word/2012/wordml" xmlns:w16cex="http://schemas.microsoft.com/office/word/2018/wordml/cex" xmlns:w16cid="http://schemas.microsoft.com/office/word/2016/wordml/cid" xmlns:w16="http://schemas.microsoft.com/office/word/2018/wordml" xmlns:w16du="http://schemas.microsoft.com/office/word/2023/wordml/word16du" xmlns:w16sdtdh="http://schemas.microsoft.com/office/word/2020/wordml/sdtdatahash" xmlns:w16sdtfl="http://schemas.microsoft.com/office/word/2024/wordml/sdtformatlock" xmlns:w16se="http://schemas.microsoft.com/office/word/2015/wordml/symex" xmlns:wpg="http://schemas.microsoft.com/office/word/2010/wordprocessingGroup" xmlns:wpi="http://schemas.microsoft.com/office/word/2010/wordprocessingInk" xmlns:wne="http://schemas.microsoft.com/office/word/2006/wordml" xmlns:wps="http://schemas.microsoft.com/office/word/2010/wordprocessingShape" mc:Ignorable="w14 w15 w16se w16cid w16 w16cex w16sdtdh w16sdtfl w16du wp14">
   <w:body>
     <w:p>
-      <w:proofErr w:type="spellStart"/>
+      <w:pPr>
+        <w:jc w:val="center"/>
+        <w:rPr>
+          <w:b/>
+          <w:bCs/>
+          <w:lang w:val="en-US"/>
+        </w:rPr>
+      </w:pPr>
+    </w:p>
+    <w:p>
+      <w:pPr>
+        <w:jc w:val="center"/>
+        <w:rPr>
+          <w:b/>
+          <w:bCs/>
+          <w:lang w:val="en-US"/>
+        </w:rPr>
+      </w:pPr>
       <w:r>
-        <w:t>C</w:t>
+        <w:rPr>
+          <w:b/>
+          <w:bCs/>
+          <w:lang w:val="en-US"/>
+        </w:rPr>
+        <w:t xml:space="preserve">The </w:t>
       </w:r>
       <w:r>
-        <w:t>onfigurations</w:t>
+        <w:rPr>
+          <w:b/>
+          <w:bCs/>
+          <w:lang w:val="en-US"/>
+        </w:rPr>
+        <w:t>Configurations</w:t>
       </w:r>
-      <w:proofErr w:type="spellEnd"/>
+      <w:r>
+        <w:rPr>
+          <w:b/>
+          <w:bCs/>
+          <w:lang w:val="en-US"/>
+        </w:rPr>
+        <w:t xml:space="preserve"> for Ablation Study</w:t>
+      </w:r>
+    </w:p>
+    <w:p>
+      <w:pPr>
+        <w:jc w:val="center"/>
+        <w:rPr>
+          <w:b/>
+          <w:bCs/>
+          <w:lang w:val="en-US"/>
+        </w:rPr>
+      </w:pPr>
     </w:p>
     <w:tbl>
       <w:tblPr>
@@ -2622,6 +2666,56 @@
     </w:sectPr>
   </w:body>
 </w:document>
+</file>
+
+<file path=word/endnotes.xml><?xml version="1.0" encoding="utf-8"?>
+<w:endnotes xmlns:wpc="http://schemas.microsoft.com/office/word/2010/wordprocessingCanvas" xmlns:cx="http://schemas.microsoft.com/office/drawing/2014/chartex" xmlns:cx1="http://schemas.microsoft.com/office/drawing/2015/9/8/chartex" xmlns:cx2="http://schemas.microsoft.com/office/drawing/2015/10/21/chartex" xmlns:cx3="http://schemas.microsoft.com/office/drawing/2016/5/9/chartex" xmlns:cx4="http://schemas.microsoft.com/office/drawing/2016/5/10/chartex" xmlns:cx5="http://schemas.microsoft.com/office/drawing/2016/5/11/chartex" xmlns:cx6="http://schemas.microsoft.com/office/drawing/2016/5/12/chartex" xmlns:cx7="http://schemas.microsoft.com/office/drawing/2016/5/13/chartex" xmlns:cx8="http://schemas.microsoft.com/office/drawing/2016/5/14/chartex" xmlns:mc="http://schemas.openxmlformats.org/markup-compatibility/2006" xmlns:aink="http://schemas.microsoft.com/office/drawing/2016/ink" xmlns:am3d="http://schemas.microsoft.com/office/drawing/2017/model3d" xmlns:o="urn:schemas-microsoft-com:office:office" xmlns:oel="http://schemas.microsoft.com/office/2019/extlst" xmlns:r="http://schemas.openxmlformats.org/officeDocument/2006/relationships" xmlns:m="http://schemas.openxmlformats.org/officeDocument/2006/math" xmlns:v="urn:schemas-microsoft-com:vml" xmlns:wp14="http://schemas.microsoft.com/office/word/2010/wordprocessingDrawing" xmlns:wp="http://schemas.openxmlformats.org/drawingml/2006/wordprocessingDrawing" xmlns:w10="urn:schemas-microsoft-com:office:word" xmlns:w="http://schemas.openxmlformats.org/wordprocessingml/2006/main" xmlns:w14="http://schemas.microsoft.com/office/word/2010/wordml" xmlns:w15="http://schemas.microsoft.com/office/word/2012/wordml" xmlns:w16cex="http://schemas.microsoft.com/office/word/2018/wordml/cex" xmlns:w16cid="http://schemas.microsoft.com/office/word/2016/wordml/cid" xmlns:w16="http://schemas.microsoft.com/office/word/2018/wordml" xmlns:w16du="http://schemas.microsoft.com/office/word/2023/wordml/word16du" xmlns:w16sdtdh="http://schemas.microsoft.com/office/word/2020/wordml/sdtdatahash" xmlns:w16sdtfl="http://schemas.microsoft.com/office/word/2024/wordml/sdtformatlock" xmlns:w16se="http://schemas.microsoft.com/office/word/2015/wordml/symex" xmlns:wpg="http://schemas.microsoft.com/office/word/2010/wordprocessingGroup" xmlns:wpi="http://schemas.microsoft.com/office/word/2010/wordprocessingInk" xmlns:wne="http://schemas.microsoft.com/office/word/2006/wordml" xmlns:wps="http://schemas.microsoft.com/office/word/2010/wordprocessingShape" mc:Ignorable="w14 w15 w16se w16cid w16 w16cex w16sdtdh w16sdtfl w16du wp14">
+  <w:endnote w:type="separator" w:id="-1">
+    <w:p>
+      <w:pPr>
+        <w:spacing w:after="0" w:line="240" w:lineRule="auto"/>
+      </w:pPr>
+      <w:r>
+        <w:separator/>
+      </w:r>
+    </w:p>
+  </w:endnote>
+  <w:endnote w:type="continuationSeparator" w:id="0">
+    <w:p>
+      <w:pPr>
+        <w:spacing w:after="0" w:line="240" w:lineRule="auto"/>
+      </w:pPr>
+      <w:r>
+        <w:continuationSeparator/>
+      </w:r>
+    </w:p>
+  </w:endnote>
+</w:endnotes>
+</file>
+
+<file path=word/footnotes.xml><?xml version="1.0" encoding="utf-8"?>
+<w:footnotes xmlns:wpc="http://schemas.microsoft.com/office/word/2010/wordprocessingCanvas" xmlns:cx="http://schemas.microsoft.com/office/drawing/2014/chartex" xmlns:cx1="http://schemas.microsoft.com/office/drawing/2015/9/8/chartex" xmlns:cx2="http://schemas.microsoft.com/office/drawing/2015/10/21/chartex" xmlns:cx3="http://schemas.microsoft.com/office/drawing/2016/5/9/chartex" xmlns:cx4="http://schemas.microsoft.com/office/drawing/2016/5/10/chartex" xmlns:cx5="http://schemas.microsoft.com/office/drawing/2016/5/11/chartex" xmlns:cx6="http://schemas.microsoft.com/office/drawing/2016/5/12/chartex" xmlns:cx7="http://schemas.microsoft.com/office/drawing/2016/5/13/chartex" xmlns:cx8="http://schemas.microsoft.com/office/drawing/2016/5/14/chartex" xmlns:mc="http://schemas.openxmlformats.org/markup-compatibility/2006" xmlns:aink="http://schemas.microsoft.com/office/drawing/2016/ink" xmlns:am3d="http://schemas.microsoft.com/office/drawing/2017/model3d" xmlns:o="urn:schemas-microsoft-com:office:office" xmlns:oel="http://schemas.microsoft.com/office/2019/extlst" xmlns:r="http://schemas.openxmlformats.org/officeDocument/2006/relationships" xmlns:m="http://schemas.openxmlformats.org/officeDocument/2006/math" xmlns:v="urn:schemas-microsoft-com:vml" xmlns:wp14="http://schemas.microsoft.com/office/word/2010/wordprocessingDrawing" xmlns:wp="http://schemas.openxmlformats.org/drawingml/2006/wordprocessingDrawing" xmlns:w10="urn:schemas-microsoft-com:office:word" xmlns:w="http://schemas.openxmlformats.org/wordprocessingml/2006/main" xmlns:w14="http://schemas.microsoft.com/office/word/2010/wordml" xmlns:w15="http://schemas.microsoft.com/office/word/2012/wordml" xmlns:w16cex="http://schemas.microsoft.com/office/word/2018/wordml/cex" xmlns:w16cid="http://schemas.microsoft.com/office/word/2016/wordml/cid" xmlns:w16="http://schemas.microsoft.com/office/word/2018/wordml" xmlns:w16du="http://schemas.microsoft.com/office/word/2023/wordml/word16du" xmlns:w16sdtdh="http://schemas.microsoft.com/office/word/2020/wordml/sdtdatahash" xmlns:w16sdtfl="http://schemas.microsoft.com/office/word/2024/wordml/sdtformatlock" xmlns:w16se="http://schemas.microsoft.com/office/word/2015/wordml/symex" xmlns:wpg="http://schemas.microsoft.com/office/word/2010/wordprocessingGroup" xmlns:wpi="http://schemas.microsoft.com/office/word/2010/wordprocessingInk" xmlns:wne="http://schemas.microsoft.com/office/word/2006/wordml" xmlns:wps="http://schemas.microsoft.com/office/word/2010/wordprocessingShape" mc:Ignorable="w14 w15 w16se w16cid w16 w16cex w16sdtdh w16sdtfl w16du wp14">
+  <w:footnote w:type="separator" w:id="-1">
+    <w:p>
+      <w:pPr>
+        <w:spacing w:after="0" w:line="240" w:lineRule="auto"/>
+      </w:pPr>
+      <w:r>
+        <w:separator/>
+      </w:r>
+    </w:p>
+  </w:footnote>
+  <w:footnote w:type="continuationSeparator" w:id="0">
+    <w:p>
+      <w:pPr>
+        <w:spacing w:after="0" w:line="240" w:lineRule="auto"/>
+      </w:pPr>
+      <w:r>
+        <w:continuationSeparator/>
+      </w:r>
+    </w:p>
+  </w:footnote>
+</w:footnotes>
 </file>
 
 <file path=word/styles.xml><?xml version="1.0" encoding="utf-8"?>
@@ -3227,6 +3321,7 @@
   <w:style w:type="character" w:default="1" w:styleId="Absatz-Standardschriftart">
     <w:name w:val="Default Paragraph Font"/>
     <w:uiPriority w:val="1"/>
+    <w:semiHidden/>
     <w:unhideWhenUsed/>
   </w:style>
   <w:style w:type="table" w:default="1" w:styleId="NormaleTabelle">
@@ -3539,6 +3634,50 @@
       <w:color w:val="0F4761" w:themeColor="accent1" w:themeShade="BF"/>
       <w:spacing w:val="5"/>
     </w:rPr>
+  </w:style>
+  <w:style w:type="paragraph" w:styleId="Kopfzeile">
+    <w:name w:val="header"/>
+    <w:basedOn w:val="Standard"/>
+    <w:link w:val="KopfzeileZchn"/>
+    <w:uiPriority w:val="99"/>
+    <w:unhideWhenUsed/>
+    <w:rsid w:val="00FD3FF8"/>
+    <w:pPr>
+      <w:tabs>
+        <w:tab w:val="center" w:pos="4536"/>
+        <w:tab w:val="right" w:pos="9072"/>
+      </w:tabs>
+      <w:spacing w:after="0" w:line="240" w:lineRule="auto"/>
+    </w:pPr>
+  </w:style>
+  <w:style w:type="character" w:customStyle="1" w:styleId="KopfzeileZchn">
+    <w:name w:val="Kopfzeile Zchn"/>
+    <w:basedOn w:val="Absatz-Standardschriftart"/>
+    <w:link w:val="Kopfzeile"/>
+    <w:uiPriority w:val="99"/>
+    <w:rsid w:val="00FD3FF8"/>
+  </w:style>
+  <w:style w:type="paragraph" w:styleId="Fuzeile">
+    <w:name w:val="footer"/>
+    <w:basedOn w:val="Standard"/>
+    <w:link w:val="FuzeileZchn"/>
+    <w:uiPriority w:val="99"/>
+    <w:unhideWhenUsed/>
+    <w:rsid w:val="00FD3FF8"/>
+    <w:pPr>
+      <w:tabs>
+        <w:tab w:val="center" w:pos="4536"/>
+        <w:tab w:val="right" w:pos="9072"/>
+      </w:tabs>
+      <w:spacing w:after="0" w:line="240" w:lineRule="auto"/>
+    </w:pPr>
+  </w:style>
+  <w:style w:type="character" w:customStyle="1" w:styleId="FuzeileZchn">
+    <w:name w:val="Fußzeile Zchn"/>
+    <w:basedOn w:val="Absatz-Standardschriftart"/>
+    <w:link w:val="Fuzeile"/>
+    <w:uiPriority w:val="99"/>
+    <w:rsid w:val="00FD3FF8"/>
   </w:style>
 </w:styles>
 </file>

</xml_diff>

<commit_message>
Highlight the best config for Qwen model.
</commit_message>
<xml_diff>
--- a/docs/Configurations.docx
+++ b/docs/Configurations.docx
@@ -1702,6 +1702,7 @@
               <w:rPr>
                 <w:rFonts w:ascii="Arial" w:eastAsia="Times New Roman" w:hAnsi="Arial" w:cs="Arial"/>
                 <w:kern w:val="0"/>
+                <w:highlight w:val="yellow"/>
                 <w:lang w:eastAsia="de-DE"/>
                 <w14:ligatures w14:val="none"/>
               </w:rPr>
@@ -1711,6 +1712,7 @@
               <w:rPr>
                 <w:rFonts w:ascii="Arial" w:eastAsia="Times New Roman" w:hAnsi="Arial" w:cs="Arial"/>
                 <w:kern w:val="0"/>
+                <w:highlight w:val="yellow"/>
                 <w:lang w:eastAsia="de-DE"/>
                 <w14:ligatures w14:val="none"/>
               </w:rPr>
@@ -1743,14 +1745,16 @@
               <w:rPr>
                 <w:rFonts w:ascii="Arial" w:eastAsia="Times New Roman" w:hAnsi="Arial" w:cs="Arial"/>
                 <w:kern w:val="0"/>
-                <w:lang w:eastAsia="de-DE"/>
-                <w14:ligatures w14:val="none"/>
-              </w:rPr>
-            </w:pPr>
-            <w:r>
-              <w:rPr>
-                <w:rFonts w:ascii="Arial" w:eastAsia="Times New Roman" w:hAnsi="Arial" w:cs="Arial"/>
-                <w:kern w:val="0"/>
+                <w:highlight w:val="yellow"/>
+                <w:lang w:eastAsia="de-DE"/>
+                <w14:ligatures w14:val="none"/>
+              </w:rPr>
+            </w:pPr>
+            <w:r>
+              <w:rPr>
+                <w:rFonts w:ascii="Arial" w:eastAsia="Times New Roman" w:hAnsi="Arial" w:cs="Arial"/>
+                <w:kern w:val="0"/>
+                <w:highlight w:val="yellow"/>
                 <w:lang w:eastAsia="de-DE"/>
                 <w14:ligatures w14:val="none"/>
               </w:rPr>
@@ -1782,14 +1786,16 @@
               <w:rPr>
                 <w:rFonts w:ascii="Arial" w:eastAsia="Times New Roman" w:hAnsi="Arial" w:cs="Arial"/>
                 <w:kern w:val="0"/>
-                <w:lang w:eastAsia="de-DE"/>
-                <w14:ligatures w14:val="none"/>
-              </w:rPr>
-            </w:pPr>
-            <w:r>
-              <w:rPr>
-                <w:rFonts w:ascii="Arial" w:eastAsia="Times New Roman" w:hAnsi="Arial" w:cs="Arial"/>
-                <w:kern w:val="0"/>
+                <w:highlight w:val="yellow"/>
+                <w:lang w:eastAsia="de-DE"/>
+                <w14:ligatures w14:val="none"/>
+              </w:rPr>
+            </w:pPr>
+            <w:r>
+              <w:rPr>
+                <w:rFonts w:ascii="Arial" w:eastAsia="Times New Roman" w:hAnsi="Arial" w:cs="Arial"/>
+                <w:kern w:val="0"/>
+                <w:highlight w:val="yellow"/>
                 <w:lang w:eastAsia="de-DE"/>
                 <w14:ligatures w14:val="none"/>
               </w:rPr>
@@ -1821,14 +1827,16 @@
               <w:rPr>
                 <w:rFonts w:ascii="Arial" w:eastAsia="Times New Roman" w:hAnsi="Arial" w:cs="Arial"/>
                 <w:kern w:val="0"/>
-                <w:lang w:eastAsia="de-DE"/>
-                <w14:ligatures w14:val="none"/>
-              </w:rPr>
-            </w:pPr>
-            <w:r>
-              <w:rPr>
-                <w:rFonts w:ascii="Arial" w:eastAsia="Times New Roman" w:hAnsi="Arial" w:cs="Arial"/>
-                <w:kern w:val="0"/>
+                <w:highlight w:val="yellow"/>
+                <w:lang w:eastAsia="de-DE"/>
+                <w14:ligatures w14:val="none"/>
+              </w:rPr>
+            </w:pPr>
+            <w:r>
+              <w:rPr>
+                <w:rFonts w:ascii="Arial" w:eastAsia="Times New Roman" w:hAnsi="Arial" w:cs="Arial"/>
+                <w:kern w:val="0"/>
+                <w:highlight w:val="yellow"/>
                 <w:lang w:eastAsia="de-DE"/>
                 <w14:ligatures w14:val="none"/>
               </w:rPr>
@@ -1860,6 +1868,7 @@
               <w:rPr>
                 <w:rFonts w:ascii="Arial" w:eastAsia="Times New Roman" w:hAnsi="Arial" w:cs="Arial"/>
                 <w:kern w:val="0"/>
+                <w:highlight w:val="yellow"/>
                 <w:lang w:eastAsia="de-DE"/>
                 <w14:ligatures w14:val="none"/>
               </w:rPr>
@@ -1870,6 +1879,7 @@
                 <w:kern w:val="0"/>
                 <w:sz w:val="20"/>
                 <w:szCs w:val="20"/>
+                <w:highlight w:val="yellow"/>
                 <w:lang w:eastAsia="de-DE"/>
                 <w14:ligatures w14:val="none"/>
               </w:rPr>
@@ -1882,6 +1892,7 @@
                 <w:kern w:val="0"/>
                 <w:sz w:val="20"/>
                 <w:szCs w:val="20"/>
+                <w:highlight w:val="yellow"/>
                 <w:lang w:eastAsia="de-DE"/>
                 <w14:ligatures w14:val="none"/>
               </w:rPr>

</xml_diff>